<commit_message>
Barcha shriftlar qora rang va rasmlar bir xil o'lchamga (6x4.5cm) keltirildi
Co-authored-by: Davron02dev <162308975+Davron02dev@users.noreply.github.com>
</commit_message>
<xml_diff>
--- a/8-band volontyorlik.docx
+++ b/8-band volontyorlik.docx
@@ -825,7 +825,7 @@
           <w:rFonts w:ascii="Times New Roman" w:hAnsi="Times New Roman" w:cs="Times New Roman"/>
           <w:b/>
           <w:bCs/>
-          <w:color w:val="EE0000"/>
+          <w:color w:val="000000"/>
           <w:sz w:val="24"/>
           <w:szCs w:val="24"/>
           <w:lang w:val="en-US"/>
@@ -909,17 +909,17 @@
       </w:r>
       <w:r>
         <w:rPr>
-          <w:color w:val="EE0000"/>
-          <w:lang w:val="en-US"/>
-        </w:rPr>
-        <w:t xml:space="preserve"> </w:t>
-      </w:r>
-      <w:r>
-        <w:rPr>
-          <w:rFonts w:ascii="Times New Roman" w:hAnsi="Times New Roman" w:cs="Times New Roman"/>
-          <w:b/>
-          <w:bCs/>
-          <w:color w:val="EE0000"/>
+          <w:color w:val="000000"/>
+          <w:lang w:val="en-US"/>
+        </w:rPr>
+        <w:t xml:space="preserve"> </w:t>
+      </w:r>
+      <w:r>
+        <w:rPr>
+          <w:rFonts w:ascii="Times New Roman" w:hAnsi="Times New Roman" w:cs="Times New Roman"/>
+          <w:b/>
+          <w:bCs/>
+          <w:color w:val="000000"/>
           <w:lang w:val="en-US"/>
         </w:rPr>
         <w:t xml:space="preserve">TDIU International </w:t>
@@ -930,7 +930,7 @@
           <w:rFonts w:ascii="Times New Roman" w:hAnsi="Times New Roman" w:cs="Times New Roman"/>
           <w:b/>
           <w:bCs/>
-          <w:color w:val="EE0000"/>
+          <w:color w:val="000000"/>
           <w:lang w:val="en-US"/>
         </w:rPr>
         <w:t>jamoasi</w:t>
@@ -941,18 +941,18 @@
           <w:rFonts w:ascii="Times New Roman" w:hAnsi="Times New Roman" w:cs="Times New Roman"/>
           <w:b/>
           <w:bCs/>
-          <w:color w:val="EE0000"/>
-          <w:lang w:val="en-US"/>
-        </w:rPr>
-        <w:t xml:space="preserve"> </w:t>
-      </w:r>
-      <w:proofErr w:type="spellStart"/>
-      <w:r>
-        <w:rPr>
-          <w:rFonts w:ascii="Times New Roman" w:hAnsi="Times New Roman" w:cs="Times New Roman"/>
-          <w:b/>
-          <w:bCs/>
-          <w:color w:val="EE0000"/>
+          <w:color w:val="000000"/>
+          <w:lang w:val="en-US"/>
+        </w:rPr>
+        <w:t xml:space="preserve"> </w:t>
+      </w:r>
+      <w:proofErr w:type="spellStart"/>
+      <w:r>
+        <w:rPr>
+          <w:rFonts w:ascii="Times New Roman" w:hAnsi="Times New Roman" w:cs="Times New Roman"/>
+          <w:b/>
+          <w:bCs/>
+          <w:color w:val="000000"/>
           <w:lang w:val="en-US"/>
         </w:rPr>
         <w:t>yordamida</w:t>
@@ -963,18 +963,18 @@
           <w:rFonts w:ascii="Times New Roman" w:hAnsi="Times New Roman" w:cs="Times New Roman"/>
           <w:b/>
           <w:bCs/>
-          <w:color w:val="EE0000"/>
-          <w:lang w:val="en-US"/>
-        </w:rPr>
-        <w:t xml:space="preserve"> </w:t>
-      </w:r>
-      <w:proofErr w:type="spellStart"/>
-      <w:r>
-        <w:rPr>
-          <w:rFonts w:ascii="Times New Roman" w:hAnsi="Times New Roman" w:cs="Times New Roman"/>
-          <w:b/>
-          <w:bCs/>
-          <w:color w:val="EE0000"/>
+          <w:color w:val="000000"/>
+          <w:lang w:val="en-US"/>
+        </w:rPr>
+        <w:t xml:space="preserve"> </w:t>
+      </w:r>
+      <w:proofErr w:type="spellStart"/>
+      <w:r>
+        <w:rPr>
+          <w:rFonts w:ascii="Times New Roman" w:hAnsi="Times New Roman" w:cs="Times New Roman"/>
+          <w:b/>
+          <w:bCs/>
+          <w:color w:val="000000"/>
           <w:lang w:val="en-US"/>
         </w:rPr>
         <w:t>o’tkazilgan</w:t>
@@ -984,17 +984,17 @@
         <w:rPr>
           <w:b/>
           <w:bCs/>
-          <w:color w:val="EE0000"/>
-          <w:lang w:val="en-US"/>
-        </w:rPr>
-        <w:t xml:space="preserve"> </w:t>
-      </w:r>
-      <w:r>
-        <w:rPr>
-          <w:rFonts w:ascii="Times New Roman" w:hAnsi="Times New Roman" w:cs="Times New Roman"/>
-          <w:b/>
-          <w:bCs/>
-          <w:color w:val="EE0000"/>
+          <w:color w:val="000000"/>
+          <w:lang w:val="en-US"/>
+        </w:rPr>
+        <w:t xml:space="preserve"> </w:t>
+      </w:r>
+      <w:r>
+        <w:rPr>
+          <w:rFonts w:ascii="Times New Roman" w:hAnsi="Times New Roman" w:cs="Times New Roman"/>
+          <w:b/>
+          <w:bCs/>
+          <w:color w:val="000000"/>
           <w:sz w:val="24"/>
           <w:szCs w:val="24"/>
           <w:lang w:val="en-US"/>
@@ -1007,7 +1007,7 @@
           <w:rFonts w:ascii="Times New Roman" w:hAnsi="Times New Roman" w:cs="Times New Roman"/>
           <w:b/>
           <w:bCs/>
-          <w:color w:val="EE0000"/>
+          <w:color w:val="000000"/>
           <w:sz w:val="24"/>
           <w:szCs w:val="24"/>
           <w:lang w:val="en-US"/>
@@ -1020,7 +1020,7 @@
           <w:rFonts w:ascii="Times New Roman" w:hAnsi="Times New Roman" w:cs="Times New Roman"/>
           <w:b/>
           <w:bCs/>
-          <w:color w:val="EE0000"/>
+          <w:color w:val="000000"/>
           <w:sz w:val="24"/>
           <w:szCs w:val="24"/>
           <w:lang w:val="en-US"/>
@@ -1033,7 +1033,7 @@
           <w:rFonts w:ascii="Times New Roman" w:hAnsi="Times New Roman" w:cs="Times New Roman"/>
           <w:b/>
           <w:bCs/>
-          <w:color w:val="EE0000"/>
+          <w:color w:val="000000"/>
           <w:sz w:val="24"/>
           <w:szCs w:val="24"/>
           <w:lang w:val="en-US"/>
@@ -1046,7 +1046,7 @@
           <w:rFonts w:ascii="Times New Roman" w:hAnsi="Times New Roman" w:cs="Times New Roman"/>
           <w:b/>
           <w:bCs/>
-          <w:color w:val="EE0000"/>
+          <w:color w:val="000000"/>
           <w:sz w:val="24"/>
           <w:szCs w:val="24"/>
           <w:lang w:val="en-US"/>
@@ -1059,7 +1059,7 @@
           <w:rFonts w:ascii="Times New Roman" w:hAnsi="Times New Roman" w:cs="Times New Roman"/>
           <w:b/>
           <w:bCs/>
-          <w:color w:val="EE0000"/>
+          <w:color w:val="000000"/>
           <w:sz w:val="24"/>
           <w:szCs w:val="24"/>
           <w:lang w:val="en-US"/>
@@ -1072,7 +1072,7 @@
           <w:rFonts w:ascii="Times New Roman" w:hAnsi="Times New Roman" w:cs="Times New Roman"/>
           <w:b/>
           <w:bCs/>
-          <w:color w:val="EE0000"/>
+          <w:color w:val="000000"/>
           <w:sz w:val="24"/>
           <w:szCs w:val="24"/>
           <w:lang w:val="en-US"/>
@@ -1085,7 +1085,7 @@
           <w:rFonts w:ascii="Times New Roman" w:hAnsi="Times New Roman" w:cs="Times New Roman"/>
           <w:b/>
           <w:bCs/>
-          <w:color w:val="EE0000"/>
+          <w:color w:val="000000"/>
           <w:sz w:val="24"/>
           <w:szCs w:val="24"/>
           <w:lang w:val="en-US"/>
@@ -1098,7 +1098,7 @@
           <w:rFonts w:ascii="Times New Roman" w:hAnsi="Times New Roman" w:cs="Times New Roman"/>
           <w:b/>
           <w:bCs/>
-          <w:color w:val="EE0000"/>
+          <w:color w:val="000000"/>
           <w:sz w:val="24"/>
           <w:szCs w:val="24"/>
           <w:lang w:val="en-US"/>
@@ -1111,7 +1111,7 @@
           <w:rFonts w:ascii="Times New Roman" w:hAnsi="Times New Roman" w:cs="Times New Roman"/>
           <w:b/>
           <w:bCs/>
-          <w:color w:val="EE0000"/>
+          <w:color w:val="000000"/>
           <w:sz w:val="24"/>
           <w:szCs w:val="24"/>
           <w:lang w:val="en-US"/>
@@ -1124,7 +1124,7 @@
           <w:rFonts w:ascii="Times New Roman" w:hAnsi="Times New Roman" w:cs="Times New Roman"/>
           <w:b/>
           <w:bCs/>
-          <w:color w:val="EE0000"/>
+          <w:color w:val="000000"/>
           <w:sz w:val="24"/>
           <w:szCs w:val="24"/>
           <w:lang w:val="en-US"/>
@@ -1137,7 +1137,7 @@
           <w:rFonts w:ascii="Times New Roman" w:hAnsi="Times New Roman" w:cs="Times New Roman"/>
           <w:b/>
           <w:bCs/>
-          <w:color w:val="EE0000"/>
+          <w:color w:val="000000"/>
           <w:sz w:val="24"/>
           <w:szCs w:val="24"/>
           <w:lang w:val="en-US"/>
@@ -1150,7 +1150,7 @@
           <w:rFonts w:ascii="Times New Roman" w:hAnsi="Times New Roman" w:cs="Times New Roman"/>
           <w:b/>
           <w:bCs/>
-          <w:color w:val="EE0000"/>
+          <w:color w:val="000000"/>
           <w:sz w:val="24"/>
           <w:szCs w:val="24"/>
           <w:lang w:val="en-US"/>
@@ -1163,7 +1163,7 @@
           <w:rFonts w:ascii="Times New Roman" w:hAnsi="Times New Roman" w:cs="Times New Roman"/>
           <w:b/>
           <w:bCs/>
-          <w:color w:val="EE0000"/>
+          <w:color w:val="000000"/>
           <w:sz w:val="24"/>
           <w:szCs w:val="24"/>
           <w:lang w:val="en-US"/>
@@ -1176,7 +1176,7 @@
           <w:rFonts w:ascii="Times New Roman" w:hAnsi="Times New Roman" w:cs="Times New Roman"/>
           <w:b/>
           <w:bCs/>
-          <w:color w:val="EE0000"/>
+          <w:color w:val="000000"/>
           <w:sz w:val="24"/>
           <w:szCs w:val="24"/>
           <w:lang w:val="en-US"/>
@@ -1189,7 +1189,7 @@
           <w:rFonts w:ascii="Times New Roman" w:hAnsi="Times New Roman" w:cs="Times New Roman"/>
           <w:b/>
           <w:bCs/>
-          <w:color w:val="EE0000"/>
+          <w:color w:val="000000"/>
           <w:sz w:val="24"/>
           <w:szCs w:val="24"/>
           <w:lang w:val="en-US"/>
@@ -1202,7 +1202,7 @@
           <w:rFonts w:ascii="Times New Roman" w:hAnsi="Times New Roman" w:cs="Times New Roman"/>
           <w:b/>
           <w:bCs/>
-          <w:color w:val="EE0000"/>
+          <w:color w:val="000000"/>
           <w:sz w:val="24"/>
           <w:szCs w:val="24"/>
           <w:lang w:val="en-US"/>
@@ -1215,7 +1215,7 @@
           <w:rFonts w:ascii="Times New Roman" w:hAnsi="Times New Roman" w:cs="Times New Roman"/>
           <w:b/>
           <w:bCs/>
-          <w:color w:val="EE0000"/>
+          <w:color w:val="000000"/>
           <w:sz w:val="24"/>
           <w:szCs w:val="24"/>
           <w:lang w:val="en-US"/>
@@ -1228,7 +1228,7 @@
           <w:rFonts w:ascii="Times New Roman" w:hAnsi="Times New Roman" w:cs="Times New Roman"/>
           <w:b/>
           <w:bCs/>
-          <w:color w:val="EE0000"/>
+          <w:color w:val="000000"/>
           <w:sz w:val="24"/>
           <w:szCs w:val="24"/>
           <w:lang w:val="en-US"/>
@@ -1241,7 +1241,7 @@
           <w:rFonts w:ascii="Times New Roman" w:hAnsi="Times New Roman" w:cs="Times New Roman"/>
           <w:b/>
           <w:bCs/>
-          <w:color w:val="EE0000"/>
+          <w:color w:val="000000"/>
           <w:sz w:val="24"/>
           <w:szCs w:val="24"/>
           <w:lang w:val="en-US"/>
@@ -1254,7 +1254,7 @@
           <w:rFonts w:ascii="Times New Roman" w:hAnsi="Times New Roman" w:cs="Times New Roman"/>
           <w:b/>
           <w:bCs/>
-          <w:color w:val="EE0000"/>
+          <w:color w:val="000000"/>
           <w:sz w:val="24"/>
           <w:szCs w:val="24"/>
           <w:lang w:val="en-US"/>
@@ -1267,7 +1267,7 @@
           <w:rFonts w:ascii="Times New Roman" w:hAnsi="Times New Roman" w:cs="Times New Roman"/>
           <w:b/>
           <w:bCs/>
-          <w:color w:val="EE0000"/>
+          <w:color w:val="000000"/>
           <w:sz w:val="24"/>
           <w:szCs w:val="24"/>
           <w:lang w:val="en-US"/>
@@ -1280,7 +1280,7 @@
           <w:rFonts w:ascii="Times New Roman" w:hAnsi="Times New Roman" w:cs="Times New Roman"/>
           <w:b/>
           <w:bCs/>
-          <w:color w:val="EE0000"/>
+          <w:color w:val="000000"/>
           <w:sz w:val="24"/>
           <w:szCs w:val="24"/>
           <w:lang w:val="en-US"/>
@@ -1293,7 +1293,7 @@
           <w:rFonts w:ascii="Times New Roman" w:hAnsi="Times New Roman" w:cs="Times New Roman"/>
           <w:b/>
           <w:bCs/>
-          <w:color w:val="EE0000"/>
+          <w:color w:val="000000"/>
           <w:sz w:val="24"/>
           <w:szCs w:val="24"/>
           <w:lang w:val="en-US"/>
@@ -1306,7 +1306,7 @@
           <w:rFonts w:ascii="Times New Roman" w:hAnsi="Times New Roman" w:cs="Times New Roman"/>
           <w:b/>
           <w:bCs/>
-          <w:color w:val="EE0000"/>
+          <w:color w:val="000000"/>
           <w:sz w:val="24"/>
           <w:szCs w:val="24"/>
           <w:lang w:val="en-US"/>
@@ -1319,7 +1319,7 @@
           <w:rFonts w:ascii="Times New Roman" w:hAnsi="Times New Roman" w:cs="Times New Roman"/>
           <w:b/>
           <w:bCs/>
-          <w:color w:val="EE0000"/>
+          <w:color w:val="000000"/>
           <w:sz w:val="24"/>
           <w:szCs w:val="24"/>
           <w:lang w:val="en-US"/>
@@ -1344,7 +1344,7 @@
           <w:rFonts w:ascii="Times New Roman" w:hAnsi="Times New Roman" w:cs="Times New Roman"/>
           <w:b/>
           <w:bCs/>
-          <w:color w:val="EE0000"/>
+          <w:color w:val="000000"/>
           <w:sz w:val="24"/>
           <w:lang w:val="en-US"/>
         </w:rPr>
@@ -1408,7 +1408,7 @@
           <w:rFonts w:ascii="Times New Roman" w:hAnsi="Times New Roman" w:cs="Times New Roman"/>
           <w:b/>
           <w:bCs/>
-          <w:color w:val="EE0000"/>
+          <w:color w:val="000000"/>
           <w:sz w:val="24"/>
           <w:lang w:val="en-US"/>
         </w:rPr>
@@ -1420,7 +1420,7 @@
           <w:rFonts w:ascii="Times New Roman" w:hAnsi="Times New Roman" w:cs="Times New Roman"/>
           <w:b/>
           <w:bCs/>
-          <w:color w:val="EE0000"/>
+          <w:color w:val="000000"/>
           <w:sz w:val="24"/>
           <w:lang w:val="en-US"/>
         </w:rPr>
@@ -1432,19 +1432,19 @@
           <w:rFonts w:ascii="Times New Roman" w:hAnsi="Times New Roman" w:cs="Times New Roman"/>
           <w:b/>
           <w:bCs/>
-          <w:color w:val="EE0000"/>
-          <w:sz w:val="24"/>
-          <w:lang w:val="en-US"/>
-        </w:rPr>
-        <w:t xml:space="preserve"> </w:t>
-      </w:r>
-      <w:proofErr w:type="spellStart"/>
-      <w:r>
-        <w:rPr>
-          <w:rFonts w:ascii="Times New Roman" w:hAnsi="Times New Roman" w:cs="Times New Roman"/>
-          <w:b/>
-          <w:bCs/>
-          <w:color w:val="EE0000"/>
+          <w:color w:val="000000"/>
+          <w:sz w:val="24"/>
+          <w:lang w:val="en-US"/>
+        </w:rPr>
+        <w:t xml:space="preserve"> </w:t>
+      </w:r>
+      <w:proofErr w:type="spellStart"/>
+      <w:r>
+        <w:rPr>
+          <w:rFonts w:ascii="Times New Roman" w:hAnsi="Times New Roman" w:cs="Times New Roman"/>
+          <w:b/>
+          <w:bCs/>
+          <w:color w:val="000000"/>
           <w:sz w:val="24"/>
           <w:lang w:val="en-US"/>
         </w:rPr>
@@ -1456,7 +1456,7 @@
           <w:rFonts w:ascii="Times New Roman" w:hAnsi="Times New Roman" w:cs="Times New Roman"/>
           <w:b/>
           <w:bCs/>
-          <w:color w:val="EE0000"/>
+          <w:color w:val="000000"/>
           <w:sz w:val="24"/>
           <w:lang w:val="en-US"/>
         </w:rPr>
@@ -1542,7 +1542,7 @@
           <w:rFonts w:ascii="Times New Roman" w:hAnsi="Times New Roman" w:cs="Times New Roman"/>
           <w:b/>
           <w:bCs/>
-          <w:color w:val="EE0000"/>
+          <w:color w:val="000000"/>
           <w:sz w:val="24"/>
           <w:lang w:val="en-US"/>
         </w:rPr>
@@ -1553,7 +1553,7 @@
           <w:rFonts w:ascii="Times New Roman" w:hAnsi="Times New Roman" w:cs="Times New Roman"/>
           <w:b/>
           <w:bCs/>
-          <w:color w:val="EE0000"/>
+          <w:color w:val="000000"/>
           <w:sz w:val="24"/>
           <w:lang w:val="en-US"/>
         </w:rPr>
@@ -1564,7 +1564,7 @@
           <w:rFonts w:ascii="Times New Roman" w:hAnsi="Times New Roman" w:cs="Times New Roman"/>
           <w:b/>
           <w:bCs/>
-          <w:color w:val="EE0000"/>
+          <w:color w:val="000000"/>
           <w:sz w:val="24"/>
           <w:lang w:val="en-US"/>
         </w:rPr>
@@ -1575,7 +1575,7 @@
           <w:rFonts w:ascii="Times New Roman" w:hAnsi="Times New Roman" w:cs="Times New Roman"/>
           <w:b/>
           <w:bCs/>
-          <w:color w:val="EE0000"/>
+          <w:color w:val="000000"/>
           <w:sz w:val="24"/>
           <w:lang w:val="en-US"/>
         </w:rPr>
@@ -1652,7 +1652,7 @@
           <w:rFonts w:ascii="Times New Roman" w:hAnsi="Times New Roman" w:cs="Times New Roman"/>
           <w:b/>
           <w:bCs/>
-          <w:color w:val="EE0000"/>
+          <w:color w:val="000000"/>
           <w:sz w:val="24"/>
           <w:lang w:val="en-US"/>
         </w:rPr>
@@ -1664,19 +1664,19 @@
           <w:rFonts w:ascii="Times New Roman" w:hAnsi="Times New Roman" w:cs="Times New Roman"/>
           <w:b/>
           <w:bCs/>
-          <w:color w:val="EE0000"/>
-          <w:sz w:val="24"/>
-          <w:lang w:val="en-US"/>
-        </w:rPr>
-        <w:t xml:space="preserve"> </w:t>
-      </w:r>
-      <w:proofErr w:type="spellStart"/>
-      <w:r>
-        <w:rPr>
-          <w:rFonts w:ascii="Times New Roman" w:hAnsi="Times New Roman" w:cs="Times New Roman"/>
-          <w:b/>
-          <w:bCs/>
-          <w:color w:val="EE0000"/>
+          <w:color w:val="000000"/>
+          <w:sz w:val="24"/>
+          <w:lang w:val="en-US"/>
+        </w:rPr>
+        <w:t xml:space="preserve"> </w:t>
+      </w:r>
+      <w:proofErr w:type="spellStart"/>
+      <w:r>
+        <w:rPr>
+          <w:rFonts w:ascii="Times New Roman" w:hAnsi="Times New Roman" w:cs="Times New Roman"/>
+          <w:b/>
+          <w:bCs/>
+          <w:color w:val="000000"/>
           <w:sz w:val="24"/>
           <w:lang w:val="en-US"/>
         </w:rPr>
@@ -1688,7 +1688,7 @@
           <w:rFonts w:ascii="Times New Roman" w:hAnsi="Times New Roman" w:cs="Times New Roman"/>
           <w:b/>
           <w:bCs/>
-          <w:color w:val="EE0000"/>
+          <w:color w:val="000000"/>
           <w:sz w:val="24"/>
           <w:lang w:val="en-US"/>
         </w:rPr>
@@ -1700,7 +1700,7 @@
           <w:rFonts w:ascii="Times New Roman" w:hAnsi="Times New Roman" w:cs="Times New Roman"/>
           <w:b/>
           <w:bCs/>
-          <w:color w:val="EE0000"/>
+          <w:color w:val="000000"/>
           <w:sz w:val="24"/>
           <w:lang w:val="en-US"/>
         </w:rPr>
@@ -1712,7 +1712,7 @@
           <w:rFonts w:ascii="Times New Roman" w:hAnsi="Times New Roman" w:cs="Times New Roman"/>
           <w:b/>
           <w:bCs/>
-          <w:color w:val="EE0000"/>
+          <w:color w:val="000000"/>
           <w:sz w:val="24"/>
           <w:lang w:val="en-US"/>
         </w:rPr>
@@ -1793,7 +1793,7 @@
                         <pic:spPr>
                           <a:xfrm>
                             <a:off x="0" y="0"/>
-                            <a:ext cx="2800350" cy="2226310"/>
+                            <a:ext cx="2160000" cy="1620000"/>
                           </a:xfrm>
                           <a:prstGeom prst="rect">
                             <a:avLst/>
@@ -1857,7 +1857,7 @@
                         <pic:spPr>
                           <a:xfrm>
                             <a:off x="0" y="0"/>
-                            <a:ext cx="3376930" cy="2286000"/>
+                            <a:ext cx="2160000" cy="1620000"/>
                           </a:xfrm>
                           <a:prstGeom prst="rect">
                             <a:avLst/>
@@ -3574,7 +3574,7 @@
     <w:unhideWhenUsed/>
     <w:rsid w:val="0078132B"/>
     <w:rPr>
-      <w:color w:val="0563C1" w:themeColor="hyperlink"/>
+      <w:color w:val="000000"/>
       <w:u w:val="single"/>
     </w:rPr>
   </w:style>
@@ -3586,7 +3586,7 @@
     <w:unhideWhenUsed/>
     <w:rsid w:val="0078132B"/>
     <w:rPr>
-      <w:color w:val="605E5C"/>
+      <w:color w:val="000000"/>
       <w:shd w:val="clear" w:color="auto" w:fill="E1DFDD"/>
     </w:rPr>
   </w:style>

</xml_diff>

<commit_message>
Imzo bo'limi 3 ustunli jadval formatiga o'zgartirildi (rasmdagi format)
</commit_message>
<xml_diff>
--- a/8-band volontyorlik.docx
+++ b/8-band volontyorlik.docx
@@ -1729,150 +1729,122 @@
         <w:br/>
       </w:r>
     </w:p>
-    <w:tbl>
-      <w:tblPr>
-        <w:tblStyle w:val="TableGrid"/>
-        <w:tblW w:w="9942" w:type="dxa"/>
-        <w:tblLook w:val="04A0" w:firstRow="1" w:lastRow="0" w:firstColumn="1" w:lastColumn="0" w:noHBand="0" w:noVBand="1"/>
-      </w:tblPr>
-      <w:tblGrid>
-        <w:gridCol w:w="4626"/>
-        <w:gridCol w:w="5534"/>
-      </w:tblGrid>
-      <w:tr>
-        <w:trPr>
-          <w:trHeight w:val="383"/>
-        </w:trPr>
-        <w:tc>
-          <w:tcPr>
-            <w:tcW w:w="4971" w:type="dxa"/>
-            <w:vAlign w:val="center"/>
-          </w:tcPr>
-          <w:p>
-            <w:pPr>
-              <w:rPr>
-                <w:rFonts w:ascii="Times New Roman" w:hAnsi="Times New Roman" w:cs="Times New Roman"/>
-                <w:sz w:val="24"/>
-                <w:lang w:val="en-US"/>
-              </w:rPr>
-            </w:pPr>
-            <w:r>
-              <w:rPr>
-                <w:rFonts w:ascii="Times New Roman" w:hAnsi="Times New Roman" w:cs="Times New Roman"/>
-                <w:noProof/>
-                <w:sz w:val="24"/>
-                <w:lang w:val="en-US"/>
-              </w:rPr>
-              <w:drawing>
-                <wp:inline distT="0" distB="0" distL="0" distR="0" wp14:anchorId="29289148" wp14:editId="5A3506CB">
-                  <wp:extent cx="2800350" cy="2226310"/>
-                  <wp:effectExtent l="0" t="0" r="0" b="2540"/>
-                  <wp:docPr id="317407208" name="Picture 2"/>
-                  <wp:cNvGraphicFramePr>
-                    <a:graphicFrameLocks xmlns:a="http://schemas.openxmlformats.org/drawingml/2006/main" noChangeAspect="1"/>
-                  </wp:cNvGraphicFramePr>
-                  <a:graphic xmlns:a="http://schemas.openxmlformats.org/drawingml/2006/main">
-                    <a:graphicData uri="http://schemas.openxmlformats.org/drawingml/2006/picture">
-                      <pic:pic xmlns:pic="http://schemas.openxmlformats.org/drawingml/2006/picture">
-                        <pic:nvPicPr>
-                          <pic:cNvPr id="317407208" name="Picture 317407208"/>
-                          <pic:cNvPicPr/>
-                        </pic:nvPicPr>
-                        <pic:blipFill>
-                          <a:blip r:embed="rId7" cstate="print">
-                            <a:extLst>
-                              <a:ext uri="{28A0092B-C50C-407E-A947-70E740481C1C}">
-                                <a14:useLocalDpi xmlns:a14="http://schemas.microsoft.com/office/drawing/2010/main" val="0"/>
-                              </a:ext>
-                            </a:extLst>
-                          </a:blip>
-                          <a:stretch>
-                            <a:fillRect/>
-                          </a:stretch>
-                        </pic:blipFill>
-                        <pic:spPr>
-                          <a:xfrm>
-                            <a:off x="0" y="0"/>
-                            <a:ext cx="2160000" cy="1620000"/>
-                          </a:xfrm>
-                          <a:prstGeom prst="rect">
-                            <a:avLst/>
-                          </a:prstGeom>
-                        </pic:spPr>
-                      </pic:pic>
-                    </a:graphicData>
-                  </a:graphic>
-                </wp:inline>
-              </w:drawing>
-            </w:r>
-          </w:p>
-        </w:tc>
-        <w:tc>
-          <w:tcPr>
-            <w:tcW w:w="4971" w:type="dxa"/>
-            <w:vAlign w:val="center"/>
-          </w:tcPr>
-          <w:p>
-            <w:pPr>
-              <w:rPr>
-                <w:rFonts w:ascii="Times New Roman" w:hAnsi="Times New Roman" w:cs="Times New Roman"/>
-                <w:sz w:val="24"/>
-                <w:lang w:val="en-US"/>
-              </w:rPr>
-            </w:pPr>
-            <w:r>
-              <w:rPr>
-                <w:rFonts w:ascii="Times New Roman" w:hAnsi="Times New Roman" w:cs="Times New Roman"/>
-                <w:noProof/>
-                <w:sz w:val="24"/>
-                <w:lang w:val="en-US"/>
-              </w:rPr>
-              <w:drawing>
-                <wp:inline distT="0" distB="0" distL="0" distR="0" wp14:anchorId="1D4238D9" wp14:editId="5350B4CD">
-                  <wp:extent cx="3376930" cy="2286000"/>
-                  <wp:effectExtent l="0" t="0" r="0" b="0"/>
-                  <wp:docPr id="1492876399" name="Picture 1"/>
-                  <wp:cNvGraphicFramePr>
-                    <a:graphicFrameLocks xmlns:a="http://schemas.openxmlformats.org/drawingml/2006/main" noChangeAspect="1"/>
-                  </wp:cNvGraphicFramePr>
-                  <a:graphic xmlns:a="http://schemas.openxmlformats.org/drawingml/2006/main">
-                    <a:graphicData uri="http://schemas.openxmlformats.org/drawingml/2006/picture">
-                      <pic:pic xmlns:pic="http://schemas.openxmlformats.org/drawingml/2006/picture">
-                        <pic:nvPicPr>
-                          <pic:cNvPr id="1492876399" name="Picture 1492876399"/>
-                          <pic:cNvPicPr/>
-                        </pic:nvPicPr>
-                        <pic:blipFill>
-                          <a:blip r:embed="rId8" cstate="print">
-                            <a:extLst>
-                              <a:ext uri="{28A0092B-C50C-407E-A947-70E740481C1C}">
-                                <a14:useLocalDpi xmlns:a14="http://schemas.microsoft.com/office/drawing/2010/main" val="0"/>
-                              </a:ext>
-                            </a:extLst>
-                          </a:blip>
-                          <a:stretch>
-                            <a:fillRect/>
-                          </a:stretch>
-                        </pic:blipFill>
-                        <pic:spPr>
-                          <a:xfrm>
-                            <a:off x="0" y="0"/>
-                            <a:ext cx="2160000" cy="1620000"/>
-                          </a:xfrm>
-                          <a:prstGeom prst="rect">
-                            <a:avLst/>
-                          </a:prstGeom>
-                        </pic:spPr>
-                      </pic:pic>
-                    </a:graphicData>
-                  </a:graphic>
-                </wp:inline>
-              </w:drawing>
-            </w:r>
-          </w:p>
-        </w:tc>
-      </w:tr>
-    </w:tbl>
+    <w:p>
+      <w:pPr>
+        <w:rPr>
+          <w:rFonts w:ascii="Times New Roman" w:hAnsi="Times New Roman" w:cs="Times New Roman"/>
+          <w:sz w:val="24"/>
+          <w:lang w:val="en-US"/>
+        </w:rPr>
+      </w:pPr>
+      <w:r>
+        <w:rPr>
+          <w:rFonts w:ascii="Times New Roman" w:hAnsi="Times New Roman" w:cs="Times New Roman"/>
+          <w:noProof/>
+          <w:sz w:val="24"/>
+          <w:lang w:val="en-US"/>
+        </w:rPr>
+        <w:drawing>
+          <wp:inline distT="0" distB="0" distL="0" distR="0" wp14:anchorId="29289148" wp14:editId="5A3506CB">
+            <wp:extent cx="2800350" cy="2226310"/>
+            <wp:effectExtent l="0" t="0" r="0" b="2540"/>
+            <wp:docPr id="317407208" name="Picture 2"/>
+            <wp:cNvGraphicFramePr>
+              <a:graphicFrameLocks xmlns:a="http://schemas.openxmlformats.org/drawingml/2006/main" noChangeAspect="1"/>
+            </wp:cNvGraphicFramePr>
+            <a:graphic xmlns:a="http://schemas.openxmlformats.org/drawingml/2006/main">
+              <a:graphicData uri="http://schemas.openxmlformats.org/drawingml/2006/picture">
+                <pic:pic xmlns:pic="http://schemas.openxmlformats.org/drawingml/2006/picture">
+                  <pic:nvPicPr>
+                    <pic:cNvPr id="317407208" name="Picture 317407208"/>
+                    <pic:cNvPicPr/>
+                  </pic:nvPicPr>
+                  <pic:blipFill>
+                    <a:blip r:embed="rId7" cstate="print">
+                      <a:extLst>
+                        <a:ext uri="{28A0092B-C50C-407E-A947-70E740481C1C}">
+                          <a14:useLocalDpi xmlns:a14="http://schemas.microsoft.com/office/drawing/2010/main" val="0"/>
+                        </a:ext>
+                      </a:extLst>
+                    </a:blip>
+                    <a:stretch>
+                      <a:fillRect/>
+                    </a:stretch>
+                  </pic:blipFill>
+                  <pic:spPr>
+                    <a:xfrm>
+                      <a:off x="0" y="0"/>
+                      <a:ext cx="2160000" cy="1620000"/>
+                    </a:xfrm>
+                    <a:prstGeom prst="rect">
+                      <a:avLst/>
+                    </a:prstGeom>
+                  </pic:spPr>
+                </pic:pic>
+              </a:graphicData>
+            </a:graphic>
+          </wp:inline>
+        </w:drawing>
+      </w:r>
+    </w:p>
+    <w:p>
+      <w:pPr>
+        <w:rPr>
+          <w:rFonts w:ascii="Times New Roman" w:hAnsi="Times New Roman" w:cs="Times New Roman"/>
+          <w:sz w:val="24"/>
+          <w:lang w:val="en-US"/>
+        </w:rPr>
+      </w:pPr>
+      <w:r>
+        <w:rPr>
+          <w:rFonts w:ascii="Times New Roman" w:hAnsi="Times New Roman" w:cs="Times New Roman"/>
+          <w:noProof/>
+          <w:sz w:val="24"/>
+          <w:lang w:val="en-US"/>
+        </w:rPr>
+        <w:drawing>
+          <wp:inline distT="0" distB="0" distL="0" distR="0" wp14:anchorId="1D4238D9" wp14:editId="5350B4CD">
+            <wp:extent cx="3376930" cy="2286000"/>
+            <wp:effectExtent l="0" t="0" r="0" b="0"/>
+            <wp:docPr id="1492876399" name="Picture 1"/>
+            <wp:cNvGraphicFramePr>
+              <a:graphicFrameLocks xmlns:a="http://schemas.openxmlformats.org/drawingml/2006/main" noChangeAspect="1"/>
+            </wp:cNvGraphicFramePr>
+            <a:graphic xmlns:a="http://schemas.openxmlformats.org/drawingml/2006/main">
+              <a:graphicData uri="http://schemas.openxmlformats.org/drawingml/2006/picture">
+                <pic:pic xmlns:pic="http://schemas.openxmlformats.org/drawingml/2006/picture">
+                  <pic:nvPicPr>
+                    <pic:cNvPr id="1492876399" name="Picture 1492876399"/>
+                    <pic:cNvPicPr/>
+                  </pic:nvPicPr>
+                  <pic:blipFill>
+                    <a:blip r:embed="rId8" cstate="print">
+                      <a:extLst>
+                        <a:ext uri="{28A0092B-C50C-407E-A947-70E740481C1C}">
+                          <a14:useLocalDpi xmlns:a14="http://schemas.microsoft.com/office/drawing/2010/main" val="0"/>
+                        </a:ext>
+                      </a:extLst>
+                    </a:blip>
+                    <a:stretch>
+                      <a:fillRect/>
+                    </a:stretch>
+                  </pic:blipFill>
+                  <pic:spPr>
+                    <a:xfrm>
+                      <a:off x="0" y="0"/>
+                      <a:ext cx="2160000" cy="1620000"/>
+                    </a:xfrm>
+                    <a:prstGeom prst="rect">
+                      <a:avLst/>
+                    </a:prstGeom>
+                  </pic:spPr>
+                </pic:pic>
+              </a:graphicData>
+            </a:graphic>
+          </wp:inline>
+        </w:drawing>
+      </w:r>
+    </w:p>
     <w:p>
       <w:pPr>
         <w:spacing w:after="0"/>
@@ -2039,629 +2011,520 @@
         </w:rPr>
       </w:pPr>
     </w:p>
+    <w:tbl>
+      <w:tblPr>
+        <w:tblW w:w="9360" w:type="dxa"/>
+        <w:tblBorders>
+          <w:top w:val="none" w:sz="0" w:space="0" w:color="auto"/>
+          <w:left w:val="none" w:sz="0" w:space="0" w:color="auto"/>
+          <w:bottom w:val="none" w:sz="0" w:space="0" w:color="auto"/>
+          <w:right w:val="none" w:sz="0" w:space="0" w:color="auto"/>
+          <w:insideH w:val="none" w:sz="0" w:space="0" w:color="auto"/>
+          <w:insideV w:val="none" w:sz="0" w:space="0" w:color="auto"/>
+        </w:tblBorders>
+      </w:tblPr>
+      <w:tblGrid>
+        <w:gridCol w:w="3800"/>
+        <w:gridCol w:w="2500"/>
+        <w:gridCol w:w="3060"/>
+      </w:tblGrid>
+      <w:tr>
+        <w:tc>
+          <w:tcPr>
+            <w:tcW w:w="3800" w:type="dxa"/>
+            <w:tcBorders>
+              <w:top w:val="none" w:sz="0" w:space="0" w:color="auto"/>
+              <w:left w:val="none" w:sz="0" w:space="0" w:color="auto"/>
+              <w:bottom w:val="none" w:sz="0" w:space="0" w:color="auto"/>
+              <w:right w:val="none" w:sz="0" w:space="0" w:color="auto"/>
+            </w:tcBorders>
+          </w:tcPr>
+          <w:p>
+            <w:pPr>
+              <w:pStyle w:val="BodyText"/>
+              <w:spacing w:after="0" w:before="0"/>
+            </w:pPr>
+            <w:r>
+              <w:rPr>
+                <w:color w:val="000000"/>
+                <w:sz w:val="20"/>
+                <w:szCs w:val="20"/>
+              </w:rPr>
+              <w:t xml:space="preserve">Menejment fakulteti talabasi:</w:t>
+            </w:r>
+          </w:p>
+          <w:p>
+            <w:pPr>
+              <w:pStyle w:val="BodyText"/>
+              <w:spacing w:after="0" w:before="0"/>
+            </w:pPr>
+            <w:r>
+              <w:rPr>
+                <w:color w:val="000000"/>
+                <w:sz w:val="20"/>
+                <w:szCs w:val="20"/>
+              </w:rPr>
+              <w:t xml:space="preserve">Lapasov D.O</w:t>
+            </w:r>
+          </w:p>
+          <w:p>
+            <w:pPr>
+              <w:pStyle w:val="BodyText"/>
+              <w:spacing w:after="0" w:before="0"/>
+            </w:pPr>
+            <w:r>
+              <w:rPr>
+                <w:color w:val="000000"/>
+                <w:sz w:val="20"/>
+                <w:szCs w:val="20"/>
+              </w:rPr>
+              <w:t xml:space="preserve"/>
+            </w:r>
+          </w:p>
+        </w:tc>
+        <w:tc>
+          <w:tcPr>
+            <w:tcW w:w="2500" w:type="dxa"/>
+            <w:tcBorders>
+              <w:top w:val="none" w:sz="0" w:space="0" w:color="auto"/>
+              <w:left w:val="none" w:sz="0" w:space="0" w:color="auto"/>
+              <w:bottom w:val="none" w:sz="0" w:space="0" w:color="auto"/>
+              <w:right w:val="none" w:sz="0" w:space="0" w:color="auto"/>
+            </w:tcBorders>
+          </w:tcPr>
+          <w:p>
+            <w:pPr>
+              <w:pStyle w:val="BodyText"/>
+              <w:jc w:val="center"/>
+              <w:spacing w:after="0" w:before="0"/>
+            </w:pPr>
+            <w:r>
+              <w:rPr>
+                <w:color w:val="000000"/>
+                <w:sz w:val="20"/>
+                <w:szCs w:val="20"/>
+              </w:rPr>
+              <w:t xml:space="preserve">imzo</w:t>
+            </w:r>
+          </w:p>
+          <w:p>
+            <w:pPr>
+              <w:pStyle w:val="BodyText"/>
+              <w:jc w:val="center"/>
+              <w:spacing w:after="0" w:before="0"/>
+            </w:pPr>
+            <w:r>
+              <w:rPr>
+                <w:u w:val="single"/>
+                <w:color w:val="000000"/>
+                <w:sz w:val="20"/>
+                <w:szCs w:val="20"/>
+              </w:rPr>
+              <w:t xml:space="preserve">__________________</w:t>
+            </w:r>
+          </w:p>
+          <w:p>
+            <w:pPr>
+              <w:pStyle w:val="BodyText"/>
+              <w:spacing w:after="0" w:before="0"/>
+            </w:pPr>
+            <w:r>
+              <w:rPr>
+                <w:color w:val="000000"/>
+                <w:sz w:val="20"/>
+                <w:szCs w:val="20"/>
+              </w:rPr>
+              <w:t xml:space="preserve"/>
+            </w:r>
+          </w:p>
+        </w:tc>
+        <w:tc>
+          <w:tcPr>
+            <w:tcW w:w="3060" w:type="dxa"/>
+            <w:tcBorders>
+              <w:top w:val="none" w:sz="0" w:space="0" w:color="auto"/>
+              <w:left w:val="none" w:sz="0" w:space="0" w:color="auto"/>
+              <w:bottom w:val="none" w:sz="0" w:space="0" w:color="auto"/>
+              <w:right w:val="none" w:sz="0" w:space="0" w:color="auto"/>
+            </w:tcBorders>
+          </w:tcPr>
+          <w:p>
+            <w:pPr>
+              <w:pStyle w:val="BodyText"/>
+              <w:spacing w:after="0" w:before="0"/>
+            </w:pPr>
+            <w:r>
+              <w:rPr>
+                <w:color w:val="000000"/>
+                <w:sz w:val="20"/>
+                <w:szCs w:val="20"/>
+              </w:rPr>
+              <w:t xml:space="preserve">Lapasov Davron Oybek o’g‘li</w:t>
+            </w:r>
+          </w:p>
+          <w:p>
+            <w:pPr>
+              <w:pStyle w:val="BodyText"/>
+              <w:spacing w:after="0" w:before="0"/>
+            </w:pPr>
+            <w:r>
+              <w:rPr>
+                <w:color w:val="000000"/>
+                <w:sz w:val="20"/>
+                <w:szCs w:val="20"/>
+              </w:rPr>
+              <w:t xml:space="preserve"/>
+            </w:r>
+          </w:p>
+          <w:p>
+            <w:pPr>
+              <w:pStyle w:val="BodyText"/>
+              <w:spacing w:after="0" w:before="0"/>
+            </w:pPr>
+            <w:r>
+              <w:rPr>
+                <w:color w:val="000000"/>
+                <w:sz w:val="20"/>
+                <w:szCs w:val="20"/>
+              </w:rPr>
+              <w:t xml:space="preserve"/>
+            </w:r>
+          </w:p>
+        </w:tc>
+      </w:tr>
+      <w:tr>
+        <w:tc>
+          <w:tcPr>
+            <w:tcW w:w="3800" w:type="dxa"/>
+            <w:tcBorders>
+              <w:top w:val="none" w:sz="0" w:space="0" w:color="auto"/>
+              <w:left w:val="none" w:sz="0" w:space="0" w:color="auto"/>
+              <w:bottom w:val="none" w:sz="0" w:space="0" w:color="auto"/>
+              <w:right w:val="none" w:sz="0" w:space="0" w:color="auto"/>
+            </w:tcBorders>
+          </w:tcPr>
+          <w:p>
+            <w:pPr>
+              <w:pStyle w:val="BodyText"/>
+              <w:spacing w:after="0" w:before="0"/>
+            </w:pPr>
+            <w:r>
+              <w:rPr>
+                <w:color w:val="000000"/>
+                <w:sz w:val="20"/>
+                <w:szCs w:val="20"/>
+              </w:rPr>
+              <w:t xml:space="preserve">Tyutorlar faoliyatini</w:t>
+            </w:r>
+          </w:p>
+          <w:p>
+            <w:pPr>
+              <w:pStyle w:val="BodyText"/>
+              <w:spacing w:after="0" w:before="0"/>
+            </w:pPr>
+            <w:r>
+              <w:rPr>
+                <w:color w:val="000000"/>
+                <w:sz w:val="20"/>
+                <w:szCs w:val="20"/>
+              </w:rPr>
+              <w:t xml:space="preserve">muvofiqlashtirish bo’limi tyutori:</w:t>
+            </w:r>
+          </w:p>
+          <w:p>
+            <w:pPr>
+              <w:pStyle w:val="BodyText"/>
+              <w:spacing w:after="0" w:before="0"/>
+            </w:pPr>
+            <w:r>
+              <w:rPr>
+                <w:color w:val="000000"/>
+                <w:sz w:val="20"/>
+                <w:szCs w:val="20"/>
+              </w:rPr>
+              <w:t xml:space="preserve">Maxsimov A.Q</w:t>
+            </w:r>
+          </w:p>
+        </w:tc>
+        <w:tc>
+          <w:tcPr>
+            <w:tcW w:w="2500" w:type="dxa"/>
+            <w:tcBorders>
+              <w:top w:val="none" w:sz="0" w:space="0" w:color="auto"/>
+              <w:left w:val="none" w:sz="0" w:space="0" w:color="auto"/>
+              <w:bottom w:val="none" w:sz="0" w:space="0" w:color="auto"/>
+              <w:right w:val="none" w:sz="0" w:space="0" w:color="auto"/>
+            </w:tcBorders>
+          </w:tcPr>
+          <w:p>
+            <w:pPr>
+              <w:pStyle w:val="BodyText"/>
+              <w:jc w:val="center"/>
+              <w:spacing w:after="0" w:before="0"/>
+            </w:pPr>
+            <w:r>
+              <w:rPr>
+                <w:color w:val="000000"/>
+                <w:sz w:val="20"/>
+                <w:szCs w:val="20"/>
+              </w:rPr>
+              <w:t xml:space="preserve">imzo</w:t>
+            </w:r>
+          </w:p>
+          <w:p>
+            <w:pPr>
+              <w:pStyle w:val="BodyText"/>
+              <w:jc w:val="center"/>
+              <w:spacing w:after="0" w:before="0"/>
+            </w:pPr>
+            <w:r>
+              <w:rPr>
+                <w:u w:val="single"/>
+                <w:color w:val="000000"/>
+                <w:sz w:val="20"/>
+                <w:szCs w:val="20"/>
+              </w:rPr>
+              <w:t xml:space="preserve">__________________</w:t>
+            </w:r>
+          </w:p>
+          <w:p>
+            <w:pPr>
+              <w:pStyle w:val="BodyText"/>
+              <w:spacing w:after="0" w:before="0"/>
+            </w:pPr>
+            <w:r>
+              <w:rPr>
+                <w:color w:val="000000"/>
+                <w:sz w:val="20"/>
+                <w:szCs w:val="20"/>
+              </w:rPr>
+              <w:t xml:space="preserve"/>
+            </w:r>
+          </w:p>
+        </w:tc>
+        <w:tc>
+          <w:tcPr>
+            <w:tcW w:w="3060" w:type="dxa"/>
+            <w:tcBorders>
+              <w:top w:val="none" w:sz="0" w:space="0" w:color="auto"/>
+              <w:left w:val="none" w:sz="0" w:space="0" w:color="auto"/>
+              <w:bottom w:val="none" w:sz="0" w:space="0" w:color="auto"/>
+              <w:right w:val="none" w:sz="0" w:space="0" w:color="auto"/>
+            </w:tcBorders>
+          </w:tcPr>
+          <w:p>
+            <w:pPr>
+              <w:pStyle w:val="BodyText"/>
+              <w:spacing w:after="0" w:before="0"/>
+            </w:pPr>
+            <w:r>
+              <w:rPr>
+                <w:color w:val="000000"/>
+                <w:sz w:val="20"/>
+                <w:szCs w:val="20"/>
+              </w:rPr>
+              <w:t xml:space="preserve">Maxsimov Akmal Qosimovich</w:t>
+            </w:r>
+          </w:p>
+          <w:p>
+            <w:pPr>
+              <w:pStyle w:val="BodyText"/>
+              <w:spacing w:after="0" w:before="0"/>
+            </w:pPr>
+            <w:r>
+              <w:rPr>
+                <w:color w:val="000000"/>
+                <w:sz w:val="20"/>
+                <w:szCs w:val="20"/>
+              </w:rPr>
+              <w:t xml:space="preserve"/>
+            </w:r>
+          </w:p>
+          <w:p>
+            <w:pPr>
+              <w:pStyle w:val="BodyText"/>
+              <w:spacing w:after="0" w:before="0"/>
+            </w:pPr>
+            <w:r>
+              <w:rPr>
+                <w:color w:val="000000"/>
+                <w:sz w:val="20"/>
+                <w:szCs w:val="20"/>
+              </w:rPr>
+              <w:t xml:space="preserve"/>
+            </w:r>
+          </w:p>
+        </w:tc>
+      </w:tr>
+      <w:tr>
+        <w:tc>
+          <w:tcPr>
+            <w:tcW w:w="3800" w:type="dxa"/>
+            <w:tcBorders>
+              <w:top w:val="none" w:sz="0" w:space="0" w:color="auto"/>
+              <w:left w:val="none" w:sz="0" w:space="0" w:color="auto"/>
+              <w:bottom w:val="none" w:sz="0" w:space="0" w:color="auto"/>
+              <w:right w:val="none" w:sz="0" w:space="0" w:color="auto"/>
+            </w:tcBorders>
+          </w:tcPr>
+          <w:p>
+            <w:pPr>
+              <w:pStyle w:val="BodyText"/>
+              <w:spacing w:after="0" w:before="0"/>
+            </w:pPr>
+            <w:r>
+              <w:rPr>
+                <w:color w:val="000000"/>
+                <w:sz w:val="20"/>
+                <w:szCs w:val="20"/>
+              </w:rPr>
+              <w:t xml:space="preserve">Yoshlar masalalari va ma’naviy-ma’rifiy</w:t>
+            </w:r>
+          </w:p>
+          <w:p>
+            <w:pPr>
+              <w:pStyle w:val="BodyText"/>
+              <w:spacing w:after="0" w:before="0"/>
+            </w:pPr>
+            <w:r>
+              <w:rPr>
+                <w:color w:val="000000"/>
+                <w:sz w:val="20"/>
+                <w:szCs w:val="20"/>
+              </w:rPr>
+              <w:t xml:space="preserve">ishlar bo’yicha dekan o’rinbosari:</w:t>
+            </w:r>
+          </w:p>
+          <w:p>
+            <w:pPr>
+              <w:pStyle w:val="BodyText"/>
+              <w:spacing w:after="0" w:before="0"/>
+            </w:pPr>
+            <w:r>
+              <w:rPr>
+                <w:color w:val="000000"/>
+                <w:sz w:val="20"/>
+                <w:szCs w:val="20"/>
+              </w:rPr>
+              <w:t xml:space="preserve">Yegamberdiyev Sh.S</w:t>
+            </w:r>
+          </w:p>
+        </w:tc>
+        <w:tc>
+          <w:tcPr>
+            <w:tcW w:w="2500" w:type="dxa"/>
+            <w:tcBorders>
+              <w:top w:val="none" w:sz="0" w:space="0" w:color="auto"/>
+              <w:left w:val="none" w:sz="0" w:space="0" w:color="auto"/>
+              <w:bottom w:val="none" w:sz="0" w:space="0" w:color="auto"/>
+              <w:right w:val="none" w:sz="0" w:space="0" w:color="auto"/>
+            </w:tcBorders>
+          </w:tcPr>
+          <w:p>
+            <w:pPr>
+              <w:pStyle w:val="BodyText"/>
+              <w:jc w:val="center"/>
+              <w:spacing w:after="0" w:before="0"/>
+            </w:pPr>
+            <w:r>
+              <w:rPr>
+                <w:color w:val="000000"/>
+                <w:sz w:val="20"/>
+                <w:szCs w:val="20"/>
+              </w:rPr>
+              <w:t xml:space="preserve">imzo</w:t>
+            </w:r>
+          </w:p>
+          <w:p>
+            <w:pPr>
+              <w:pStyle w:val="BodyText"/>
+              <w:jc w:val="center"/>
+              <w:spacing w:after="0" w:before="0"/>
+            </w:pPr>
+            <w:r>
+              <w:rPr>
+                <w:u w:val="single"/>
+                <w:color w:val="000000"/>
+                <w:sz w:val="20"/>
+                <w:szCs w:val="20"/>
+              </w:rPr>
+              <w:t xml:space="preserve">__________________</w:t>
+            </w:r>
+          </w:p>
+          <w:p>
+            <w:pPr>
+              <w:pStyle w:val="BodyText"/>
+              <w:spacing w:after="0" w:before="0"/>
+            </w:pPr>
+            <w:r>
+              <w:rPr>
+                <w:color w:val="000000"/>
+                <w:sz w:val="20"/>
+                <w:szCs w:val="20"/>
+              </w:rPr>
+              <w:t xml:space="preserve"/>
+            </w:r>
+          </w:p>
+        </w:tc>
+        <w:tc>
+          <w:tcPr>
+            <w:tcW w:w="3060" w:type="dxa"/>
+            <w:tcBorders>
+              <w:top w:val="none" w:sz="0" w:space="0" w:color="auto"/>
+              <w:left w:val="none" w:sz="0" w:space="0" w:color="auto"/>
+              <w:bottom w:val="none" w:sz="0" w:space="0" w:color="auto"/>
+              <w:right w:val="none" w:sz="0" w:space="0" w:color="auto"/>
+            </w:tcBorders>
+          </w:tcPr>
+          <w:p>
+            <w:pPr>
+              <w:pStyle w:val="BodyText"/>
+              <w:spacing w:after="0" w:before="0"/>
+            </w:pPr>
+            <w:r>
+              <w:rPr>
+                <w:color w:val="000000"/>
+                <w:sz w:val="20"/>
+                <w:szCs w:val="20"/>
+              </w:rPr>
+              <w:t xml:space="preserve">Yegamberdiyev Shuhrat Satimbayevich</w:t>
+            </w:r>
+          </w:p>
+          <w:p>
+            <w:pPr>
+              <w:pStyle w:val="BodyText"/>
+              <w:spacing w:after="0" w:before="0"/>
+            </w:pPr>
+            <w:r>
+              <w:rPr>
+                <w:color w:val="000000"/>
+                <w:sz w:val="20"/>
+                <w:szCs w:val="20"/>
+              </w:rPr>
+              <w:t xml:space="preserve"/>
+            </w:r>
+          </w:p>
+          <w:p>
+            <w:pPr>
+              <w:pStyle w:val="BodyText"/>
+              <w:spacing w:after="0" w:before="0"/>
+            </w:pPr>
+            <w:r>
+              <w:rPr>
+                <w:color w:val="000000"/>
+                <w:sz w:val="20"/>
+                <w:szCs w:val="20"/>
+              </w:rPr>
+              <w:t xml:space="preserve"/>
+            </w:r>
+          </w:p>
+        </w:tc>
+      </w:tr>
+    </w:tbl>
     <w:p>
       <w:pPr>
-        <w:rPr>
-          <w:rFonts w:ascii="Times New Roman" w:hAnsi="Times New Roman" w:cs="Times New Roman"/>
-          <w:b/>
-          <w:bCs/>
-          <w:i/>
-          <w:iCs/>
-          <w:sz w:val="24"/>
-          <w:lang w:val="en-US"/>
-        </w:rPr>
-      </w:pPr>
-      <w:proofErr w:type="spellStart"/>
-      <w:r>
-        <w:rPr>
-          <w:rFonts w:ascii="Times New Roman" w:hAnsi="Times New Roman" w:cs="Times New Roman"/>
-          <w:b/>
-          <w:bCs/>
-          <w:sz w:val="24"/>
-          <w:lang w:val="en-US"/>
-        </w:rPr>
-        <w:t>Menejment</w:t>
-      </w:r>
-      <w:proofErr w:type="spellEnd"/>
-      <w:r>
-        <w:rPr>
-          <w:rFonts w:ascii="Times New Roman" w:hAnsi="Times New Roman" w:cs="Times New Roman"/>
-          <w:b/>
-          <w:bCs/>
-          <w:sz w:val="24"/>
-          <w:lang w:val="en-US"/>
-        </w:rPr>
-        <w:t xml:space="preserve"> </w:t>
-      </w:r>
-      <w:proofErr w:type="spellStart"/>
-      <w:r>
-        <w:rPr>
-          <w:rFonts w:ascii="Times New Roman" w:hAnsi="Times New Roman" w:cs="Times New Roman"/>
-          <w:b/>
-          <w:bCs/>
-          <w:sz w:val="24"/>
-          <w:lang w:val="en-US"/>
-        </w:rPr>
-        <w:t>fakulteti</w:t>
-      </w:r>
-      <w:proofErr w:type="spellEnd"/>
-      <w:r>
-        <w:rPr>
-          <w:rFonts w:ascii="Times New Roman" w:hAnsi="Times New Roman" w:cs="Times New Roman"/>
-          <w:b/>
-          <w:bCs/>
-          <w:sz w:val="24"/>
-          <w:lang w:val="en-US"/>
-        </w:rPr>
-        <w:t xml:space="preserve"> </w:t>
-      </w:r>
-      <w:proofErr w:type="spellStart"/>
-      <w:r>
-        <w:rPr>
-          <w:rFonts w:ascii="Times New Roman" w:hAnsi="Times New Roman" w:cs="Times New Roman"/>
-          <w:b/>
-          <w:bCs/>
-          <w:sz w:val="24"/>
-          <w:lang w:val="en-US"/>
-        </w:rPr>
-        <w:t>talabasi</w:t>
-      </w:r>
-      <w:proofErr w:type="spellEnd"/>
-      <w:r>
-        <w:rPr>
-          <w:rFonts w:ascii="Times New Roman" w:hAnsi="Times New Roman" w:cs="Times New Roman"/>
-          <w:b/>
-          <w:bCs/>
-          <w:sz w:val="24"/>
-          <w:lang w:val="en-US"/>
-        </w:rPr>
-        <w:t xml:space="preserve">: </w:t>
-      </w:r>
-      <w:proofErr w:type="spellStart"/>
-      <w:r>
-        <w:rPr>
-          <w:rFonts w:ascii="Times New Roman" w:hAnsi="Times New Roman" w:cs="Times New Roman"/>
-          <w:b/>
-          <w:bCs/>
-          <w:sz w:val="24"/>
-          <w:lang w:val="en-US"/>
-        </w:rPr>
-        <w:t>Lapasov</w:t>
-      </w:r>
-      <w:proofErr w:type="spellEnd"/>
-      <w:r>
-        <w:rPr>
-          <w:rFonts w:ascii="Times New Roman" w:hAnsi="Times New Roman" w:cs="Times New Roman"/>
-          <w:b/>
-          <w:bCs/>
-          <w:sz w:val="24"/>
-          <w:lang w:val="en-US"/>
-        </w:rPr>
-        <w:t xml:space="preserve"> D.O                           </w:t>
-      </w:r>
-      <w:proofErr w:type="spellStart"/>
-      <w:r>
-        <w:rPr>
-          <w:rFonts w:ascii="Times New Roman" w:hAnsi="Times New Roman" w:cs="Times New Roman"/>
-          <w:b/>
-          <w:bCs/>
-          <w:sz w:val="24"/>
-          <w:lang w:val="en-US"/>
-        </w:rPr>
-        <w:t>imzo</w:t>
-      </w:r>
-      <w:proofErr w:type="spellEnd"/>
-      <w:r>
-        <w:rPr>
-          <w:rFonts w:ascii="Times New Roman" w:hAnsi="Times New Roman" w:cs="Times New Roman"/>
-          <w:b/>
-          <w:bCs/>
-          <w:sz w:val="24"/>
-          <w:lang w:val="en-US"/>
-        </w:rPr>
-        <w:t xml:space="preserve"> __________________</w:t>
-      </w:r>
-    </w:p>
-    <w:p>
-      <w:pPr>
-        <w:jc w:val="center"/>
-        <w:rPr>
-          <w:rFonts w:ascii="Times New Roman" w:hAnsi="Times New Roman" w:cs="Times New Roman"/>
-          <w:b/>
-          <w:bCs/>
-          <w:i/>
-          <w:iCs/>
-          <w:sz w:val="24"/>
-          <w:lang w:val="en-US"/>
-        </w:rPr>
-      </w:pPr>
-    </w:p>
-    <w:p>
-      <w:pPr>
-        <w:rPr>
-          <w:rFonts w:ascii="Times New Roman" w:hAnsi="Times New Roman" w:cs="Times New Roman"/>
-          <w:b/>
-          <w:bCs/>
-          <w:sz w:val="24"/>
-          <w:lang w:val="en-US"/>
-        </w:rPr>
-      </w:pPr>
-      <w:proofErr w:type="spellStart"/>
-      <w:r>
-        <w:rPr>
-          <w:rFonts w:ascii="Times New Roman" w:hAnsi="Times New Roman" w:cs="Times New Roman"/>
-          <w:b/>
-          <w:bCs/>
-          <w:sz w:val="24"/>
-          <w:lang w:val="en-US"/>
-        </w:rPr>
-        <w:t>Tyutorlar</w:t>
-      </w:r>
-      <w:proofErr w:type="spellEnd"/>
-      <w:r>
-        <w:rPr>
-          <w:rFonts w:ascii="Times New Roman" w:hAnsi="Times New Roman" w:cs="Times New Roman"/>
-          <w:b/>
-          <w:bCs/>
-          <w:sz w:val="24"/>
-          <w:lang w:val="en-US"/>
-        </w:rPr>
-        <w:t xml:space="preserve"> </w:t>
-      </w:r>
-      <w:proofErr w:type="spellStart"/>
-      <w:r>
-        <w:rPr>
-          <w:rFonts w:ascii="Times New Roman" w:hAnsi="Times New Roman" w:cs="Times New Roman"/>
-          <w:b/>
-          <w:bCs/>
-          <w:sz w:val="24"/>
-          <w:lang w:val="en-US"/>
-        </w:rPr>
-        <w:t>faoliyatini</w:t>
-      </w:r>
-      <w:proofErr w:type="spellEnd"/>
-      <w:r>
-        <w:rPr>
-          <w:rFonts w:ascii="Times New Roman" w:hAnsi="Times New Roman" w:cs="Times New Roman"/>
-          <w:b/>
-          <w:bCs/>
-          <w:sz w:val="24"/>
-          <w:lang w:val="en-US"/>
-        </w:rPr>
-        <w:t xml:space="preserve"> </w:t>
-      </w:r>
-    </w:p>
-    <w:p>
-      <w:pPr>
-        <w:rPr>
-          <w:rFonts w:ascii="Times New Roman" w:hAnsi="Times New Roman" w:cs="Times New Roman"/>
-          <w:b/>
-          <w:bCs/>
-          <w:i/>
-          <w:iCs/>
-          <w:sz w:val="24"/>
-          <w:lang w:val="en-US"/>
-        </w:rPr>
-      </w:pPr>
-      <w:proofErr w:type="spellStart"/>
-      <w:r>
-        <w:rPr>
-          <w:rFonts w:ascii="Times New Roman" w:hAnsi="Times New Roman" w:cs="Times New Roman"/>
-          <w:b/>
-          <w:bCs/>
-          <w:sz w:val="24"/>
-          <w:lang w:val="en-US"/>
-        </w:rPr>
-        <w:t>muvofiqlashtirish</w:t>
-      </w:r>
-      <w:proofErr w:type="spellEnd"/>
-      <w:r>
-        <w:rPr>
-          <w:rFonts w:ascii="Times New Roman" w:hAnsi="Times New Roman" w:cs="Times New Roman"/>
-          <w:b/>
-          <w:bCs/>
-          <w:sz w:val="24"/>
-          <w:lang w:val="en-US"/>
-        </w:rPr>
-        <w:t xml:space="preserve"> </w:t>
-      </w:r>
-      <w:proofErr w:type="spellStart"/>
-      <w:r>
-        <w:rPr>
-          <w:rFonts w:ascii="Times New Roman" w:hAnsi="Times New Roman" w:cs="Times New Roman"/>
-          <w:b/>
-          <w:bCs/>
-          <w:sz w:val="24"/>
-          <w:lang w:val="en-US"/>
-        </w:rPr>
-        <w:t>bo’limi</w:t>
-      </w:r>
-      <w:proofErr w:type="spellEnd"/>
-      <w:r>
-        <w:rPr>
-          <w:rFonts w:ascii="Times New Roman" w:hAnsi="Times New Roman" w:cs="Times New Roman"/>
-          <w:b/>
-          <w:bCs/>
-          <w:sz w:val="24"/>
-          <w:lang w:val="en-US"/>
-        </w:rPr>
-        <w:t xml:space="preserve"> </w:t>
-      </w:r>
-      <w:proofErr w:type="spellStart"/>
-      <w:r>
-        <w:rPr>
-          <w:rFonts w:ascii="Times New Roman" w:hAnsi="Times New Roman" w:cs="Times New Roman"/>
-          <w:b/>
-          <w:bCs/>
-          <w:sz w:val="24"/>
-          <w:lang w:val="en-US"/>
-        </w:rPr>
-        <w:t>tyutori</w:t>
-      </w:r>
-      <w:proofErr w:type="spellEnd"/>
-      <w:r>
-        <w:rPr>
-          <w:rFonts w:ascii="Times New Roman" w:hAnsi="Times New Roman" w:cs="Times New Roman"/>
-          <w:b/>
-          <w:bCs/>
-          <w:sz w:val="24"/>
-          <w:lang w:val="en-US"/>
-        </w:rPr>
-        <w:t>:</w:t>
-      </w:r>
-      <w:r>
-        <w:rPr>
-          <w:rFonts w:ascii="Times New Roman" w:hAnsi="Times New Roman" w:cs="Times New Roman"/>
-          <w:b/>
-          <w:bCs/>
-          <w:sz w:val="24"/>
-          <w:lang w:val="en-US"/>
-        </w:rPr>
-        <w:t xml:space="preserve"> </w:t>
-      </w:r>
-      <w:proofErr w:type="spellStart"/>
-      <w:r>
-        <w:rPr>
-          <w:rFonts w:ascii="Times New Roman" w:hAnsi="Times New Roman" w:cs="Times New Roman"/>
-          <w:b/>
-          <w:bCs/>
-          <w:sz w:val="24"/>
-          <w:lang w:val="en-US"/>
-        </w:rPr>
-        <w:t>Maxsimov</w:t>
-      </w:r>
-      <w:proofErr w:type="spellEnd"/>
-      <w:r>
-        <w:rPr>
-          <w:rFonts w:ascii="Times New Roman" w:hAnsi="Times New Roman" w:cs="Times New Roman"/>
-          <w:b/>
-          <w:bCs/>
-          <w:sz w:val="24"/>
-          <w:lang w:val="en-US"/>
-        </w:rPr>
-        <w:t xml:space="preserve"> A.Q</w:t>
-      </w:r>
-      <w:r>
-        <w:rPr>
-          <w:rFonts w:ascii="Times New Roman" w:hAnsi="Times New Roman" w:cs="Times New Roman"/>
-          <w:b/>
-          <w:bCs/>
-          <w:sz w:val="24"/>
-          <w:lang w:val="en-US"/>
-        </w:rPr>
-        <w:t xml:space="preserve">                 </w:t>
-      </w:r>
-      <w:proofErr w:type="spellStart"/>
-      <w:r>
-        <w:rPr>
-          <w:rFonts w:ascii="Times New Roman" w:hAnsi="Times New Roman" w:cs="Times New Roman"/>
-          <w:b/>
-          <w:bCs/>
-          <w:sz w:val="24"/>
-          <w:lang w:val="en-US"/>
-        </w:rPr>
-        <w:t>imzo</w:t>
-      </w:r>
-      <w:proofErr w:type="spellEnd"/>
-      <w:r>
-        <w:rPr>
-          <w:rFonts w:ascii="Times New Roman" w:hAnsi="Times New Roman" w:cs="Times New Roman"/>
-          <w:b/>
-          <w:bCs/>
-          <w:sz w:val="24"/>
-          <w:lang w:val="en-US"/>
-        </w:rPr>
-        <w:t>___________________</w:t>
-      </w:r>
-    </w:p>
-    <w:p>
-      <w:pPr>
-        <w:jc w:val="center"/>
-        <w:rPr>
-          <w:rFonts w:ascii="Times New Roman" w:hAnsi="Times New Roman" w:cs="Times New Roman"/>
-          <w:b/>
-          <w:bCs/>
-          <w:i/>
-          <w:iCs/>
-          <w:sz w:val="24"/>
-          <w:lang w:val="en-US"/>
-        </w:rPr>
-      </w:pPr>
-    </w:p>
-    <w:p>
-      <w:pPr>
-        <w:rPr>
-          <w:rFonts w:ascii="Times New Roman" w:hAnsi="Times New Roman" w:cs="Times New Roman"/>
-          <w:b/>
-          <w:bCs/>
-          <w:sz w:val="24"/>
-          <w:lang w:val="en-US"/>
-        </w:rPr>
-      </w:pPr>
-      <w:proofErr w:type="spellStart"/>
-      <w:r>
-        <w:rPr>
-          <w:rFonts w:ascii="Times New Roman" w:hAnsi="Times New Roman" w:cs="Times New Roman"/>
-          <w:b/>
-          <w:bCs/>
-          <w:sz w:val="24"/>
-          <w:lang w:val="en-US"/>
-        </w:rPr>
-        <w:t>Yoshlar</w:t>
-      </w:r>
-      <w:proofErr w:type="spellEnd"/>
-      <w:r>
-        <w:rPr>
-          <w:rFonts w:ascii="Times New Roman" w:hAnsi="Times New Roman" w:cs="Times New Roman"/>
-          <w:b/>
-          <w:bCs/>
-          <w:sz w:val="24"/>
-          <w:lang w:val="en-US"/>
-        </w:rPr>
-        <w:t xml:space="preserve"> </w:t>
-      </w:r>
-      <w:proofErr w:type="spellStart"/>
-      <w:r>
-        <w:rPr>
-          <w:rFonts w:ascii="Times New Roman" w:hAnsi="Times New Roman" w:cs="Times New Roman"/>
-          <w:b/>
-          <w:bCs/>
-          <w:sz w:val="24"/>
-          <w:lang w:val="en-US"/>
-        </w:rPr>
-        <w:t>masalalari</w:t>
-      </w:r>
-      <w:proofErr w:type="spellEnd"/>
-      <w:r>
-        <w:rPr>
-          <w:rFonts w:ascii="Times New Roman" w:hAnsi="Times New Roman" w:cs="Times New Roman"/>
-          <w:b/>
-          <w:bCs/>
-          <w:sz w:val="24"/>
-          <w:lang w:val="en-US"/>
-        </w:rPr>
-        <w:t xml:space="preserve"> </w:t>
-      </w:r>
-      <w:proofErr w:type="spellStart"/>
-      <w:r>
-        <w:rPr>
-          <w:rFonts w:ascii="Times New Roman" w:hAnsi="Times New Roman" w:cs="Times New Roman"/>
-          <w:b/>
-          <w:bCs/>
-          <w:sz w:val="24"/>
-          <w:lang w:val="en-US"/>
-        </w:rPr>
-        <w:t>va</w:t>
-      </w:r>
-      <w:proofErr w:type="spellEnd"/>
-      <w:r>
-        <w:rPr>
-          <w:rFonts w:ascii="Times New Roman" w:hAnsi="Times New Roman" w:cs="Times New Roman"/>
-          <w:b/>
-          <w:bCs/>
-          <w:sz w:val="24"/>
-          <w:lang w:val="en-US"/>
-        </w:rPr>
-        <w:t xml:space="preserve"> </w:t>
-      </w:r>
-    </w:p>
-    <w:p>
-      <w:pPr>
-        <w:rPr>
-          <w:rFonts w:ascii="Times New Roman" w:hAnsi="Times New Roman" w:cs="Times New Roman"/>
-          <w:b/>
-          <w:bCs/>
-          <w:sz w:val="24"/>
-          <w:lang w:val="en-US"/>
-        </w:rPr>
-      </w:pPr>
-      <w:proofErr w:type="spellStart"/>
-      <w:r>
-        <w:rPr>
-          <w:rFonts w:ascii="Times New Roman" w:hAnsi="Times New Roman" w:cs="Times New Roman"/>
-          <w:b/>
-          <w:bCs/>
-          <w:sz w:val="24"/>
-          <w:lang w:val="en-US"/>
-        </w:rPr>
-        <w:t>ma’naviy-ma’rifiy</w:t>
-      </w:r>
-      <w:proofErr w:type="spellEnd"/>
-      <w:r>
-        <w:rPr>
-          <w:rFonts w:ascii="Times New Roman" w:hAnsi="Times New Roman" w:cs="Times New Roman"/>
-          <w:b/>
-          <w:bCs/>
-          <w:sz w:val="24"/>
-          <w:lang w:val="en-US"/>
-        </w:rPr>
-        <w:t xml:space="preserve"> </w:t>
-      </w:r>
-      <w:proofErr w:type="spellStart"/>
-      <w:r>
-        <w:rPr>
-          <w:rFonts w:ascii="Times New Roman" w:hAnsi="Times New Roman" w:cs="Times New Roman"/>
-          <w:b/>
-          <w:bCs/>
-          <w:sz w:val="24"/>
-          <w:lang w:val="en-US"/>
-        </w:rPr>
-        <w:t>ishlar</w:t>
-      </w:r>
-      <w:proofErr w:type="spellEnd"/>
-      <w:r>
-        <w:rPr>
-          <w:rFonts w:ascii="Times New Roman" w:hAnsi="Times New Roman" w:cs="Times New Roman"/>
-          <w:b/>
-          <w:bCs/>
-          <w:sz w:val="24"/>
-          <w:lang w:val="en-US"/>
-        </w:rPr>
-        <w:t xml:space="preserve"> </w:t>
-      </w:r>
-    </w:p>
-    <w:p>
-      <w:pPr>
-        <w:rPr>
-          <w:rFonts w:ascii="Times New Roman" w:hAnsi="Times New Roman" w:cs="Times New Roman"/>
-          <w:b/>
-          <w:bCs/>
-          <w:sz w:val="24"/>
-          <w:lang w:val="en-US"/>
-        </w:rPr>
-      </w:pPr>
-      <w:proofErr w:type="spellStart"/>
-      <w:r>
-        <w:rPr>
-          <w:rFonts w:ascii="Times New Roman" w:hAnsi="Times New Roman" w:cs="Times New Roman"/>
-          <w:b/>
-          <w:bCs/>
-          <w:sz w:val="24"/>
-          <w:lang w:val="en-US"/>
-        </w:rPr>
-        <w:t>bo’yicha</w:t>
-      </w:r>
-      <w:proofErr w:type="spellEnd"/>
-      <w:r>
-        <w:rPr>
-          <w:rFonts w:ascii="Times New Roman" w:hAnsi="Times New Roman" w:cs="Times New Roman"/>
-          <w:b/>
-          <w:bCs/>
-          <w:sz w:val="24"/>
-          <w:lang w:val="en-US"/>
-        </w:rPr>
-        <w:t xml:space="preserve"> </w:t>
-      </w:r>
-      <w:proofErr w:type="spellStart"/>
-      <w:r>
-        <w:rPr>
-          <w:rFonts w:ascii="Times New Roman" w:hAnsi="Times New Roman" w:cs="Times New Roman"/>
-          <w:b/>
-          <w:bCs/>
-          <w:sz w:val="24"/>
-          <w:lang w:val="en-US"/>
-        </w:rPr>
-        <w:t>dekan</w:t>
-      </w:r>
-      <w:proofErr w:type="spellEnd"/>
-      <w:r>
-        <w:rPr>
-          <w:rFonts w:ascii="Times New Roman" w:hAnsi="Times New Roman" w:cs="Times New Roman"/>
-          <w:b/>
-          <w:bCs/>
-          <w:sz w:val="24"/>
-          <w:lang w:val="en-US"/>
-        </w:rPr>
-        <w:t xml:space="preserve"> </w:t>
-      </w:r>
-      <w:proofErr w:type="spellStart"/>
-      <w:r>
-        <w:rPr>
-          <w:rFonts w:ascii="Times New Roman" w:hAnsi="Times New Roman" w:cs="Times New Roman"/>
-          <w:b/>
-          <w:bCs/>
-          <w:sz w:val="24"/>
-          <w:lang w:val="en-US"/>
-        </w:rPr>
-        <w:t>o’rinbosari</w:t>
-      </w:r>
-      <w:proofErr w:type="spellEnd"/>
-      <w:r>
-        <w:rPr>
-          <w:rFonts w:ascii="Times New Roman" w:hAnsi="Times New Roman" w:cs="Times New Roman"/>
-          <w:b/>
-          <w:bCs/>
-          <w:sz w:val="24"/>
-          <w:lang w:val="en-US"/>
-        </w:rPr>
-        <w:t xml:space="preserve">: </w:t>
-      </w:r>
-      <w:proofErr w:type="spellStart"/>
-      <w:r>
-        <w:rPr>
-          <w:rFonts w:ascii="Times New Roman" w:hAnsi="Times New Roman" w:cs="Times New Roman"/>
-          <w:b/>
-          <w:bCs/>
-          <w:sz w:val="24"/>
-          <w:lang w:val="en-US"/>
-        </w:rPr>
-        <w:t>Yegamberdiyev</w:t>
-      </w:r>
-      <w:proofErr w:type="spellEnd"/>
-      <w:r>
-        <w:rPr>
-          <w:rFonts w:ascii="Times New Roman" w:hAnsi="Times New Roman" w:cs="Times New Roman"/>
-          <w:b/>
-          <w:bCs/>
-          <w:sz w:val="24"/>
-          <w:lang w:val="en-US"/>
-        </w:rPr>
-        <w:t xml:space="preserve"> </w:t>
-      </w:r>
-      <w:proofErr w:type="spellStart"/>
-      <w:r>
-        <w:rPr>
-          <w:rFonts w:ascii="Times New Roman" w:hAnsi="Times New Roman" w:cs="Times New Roman"/>
-          <w:b/>
-          <w:bCs/>
-          <w:sz w:val="24"/>
-          <w:lang w:val="en-US"/>
-        </w:rPr>
-        <w:t>Sh.S</w:t>
-      </w:r>
-      <w:proofErr w:type="spellEnd"/>
-      <w:r>
-        <w:rPr>
-          <w:rFonts w:ascii="Times New Roman" w:hAnsi="Times New Roman" w:cs="Times New Roman"/>
-          <w:b/>
-          <w:bCs/>
-          <w:sz w:val="24"/>
-          <w:lang w:val="en-US"/>
-        </w:rPr>
-        <w:t xml:space="preserve">                  </w:t>
-      </w:r>
-      <w:proofErr w:type="spellStart"/>
-      <w:r>
-        <w:rPr>
-          <w:rFonts w:ascii="Times New Roman" w:hAnsi="Times New Roman" w:cs="Times New Roman"/>
-          <w:b/>
-          <w:bCs/>
-          <w:sz w:val="24"/>
-          <w:lang w:val="en-US"/>
-        </w:rPr>
-        <w:t>imzo</w:t>
-      </w:r>
-      <w:proofErr w:type="spellEnd"/>
-      <w:r>
-        <w:rPr>
-          <w:rFonts w:ascii="Times New Roman" w:hAnsi="Times New Roman" w:cs="Times New Roman"/>
-          <w:b/>
-          <w:bCs/>
-          <w:sz w:val="24"/>
-          <w:lang w:val="en-US"/>
-        </w:rPr>
-        <w:t xml:space="preserve"> __________________</w:t>
-      </w:r>
+        <w:pStyle w:val="BodyText"/>
+      </w:pPr>
     </w:p>
     <w:p>
       <w:pPr>

</xml_diff>